<commit_message>
fix(kt10): add responsive cross-browser compliance testing
Add Sauce Demo viewport matrix for Chrome/Firefox desktop-tablet-phone with evidence and updated KT10 report.

Co-authored-by: Cursor <cursoragent@cursor.com>
</commit_message>
<xml_diff>
--- a/reports/KT10.docx
+++ b/reports/KT10.docx
@@ -24,12 +24,269 @@
       <w:r>
         <w:rPr>
           <w:rFonts w:ascii="Times New Roman" w:hAnsi="Times New Roman" w:eastAsia="Times New Roman"/>
+          <w:b/>
+          <w:sz w:val="24"/>
+        </w:rPr>
+        <w:t>КТ №10. Кроссбраузерное / адаптивное тестирование</w:t>
+      </w:r>
+    </w:p>
+    <w:p>
+      <w:pPr>
+        <w:spacing w:after="120"/>
+        <w:jc w:val="center"/>
+      </w:pPr>
+      <w:r>
+        <w:rPr>
+          <w:rFonts w:ascii="Times New Roman" w:hAnsi="Times New Roman" w:eastAsia="Times New Roman"/>
           <w:b w:val="0"/>
           <w:sz w:val="24"/>
         </w:rPr>
-        <w:t>Студент: _______________________________________</w:t>
+        <w:t>Дата remediation: 2026-10-10</w:t>
       </w:r>
     </w:p>
+    <w:p>
+      <w:pPr>
+        <w:pStyle w:val="Heading1"/>
+      </w:pPr>
+      <w:r>
+        <w:rPr>
+          <w:rFonts w:ascii="Times New Roman" w:hAnsi="Times New Roman" w:eastAsia="Times New Roman"/>
+          <w:b/>
+          <w:sz w:val="28"/>
+        </w:rPr>
+        <w:t>1. Цель (оригинал презентации)</w:t>
+      </w:r>
+    </w:p>
+    <w:p>
+      <w:pPr>
+        <w:spacing w:after="120"/>
+      </w:pPr>
+      <w:r>
+        <w:rPr>
+          <w:rFonts w:ascii="Times New Roman" w:hAnsi="Times New Roman" w:eastAsia="Times New Roman"/>
+          <w:b w:val="0"/>
+          <w:sz w:val="24"/>
+        </w:rPr>
+        <w:t>Протестировать публичное адаптивное веб-приложение в разных браузерах с эмуляцией desktop/tablet/smartphone, проверить меню/формы/раскладку, зафиксировать проблемы и подготовить отчёт.</w:t>
+      </w:r>
+    </w:p>
+    <w:p>
+      <w:pPr>
+        <w:pStyle w:val="Heading1"/>
+      </w:pPr>
+      <w:r>
+        <w:rPr>
+          <w:rFonts w:ascii="Times New Roman" w:hAnsi="Times New Roman" w:eastAsia="Times New Roman"/>
+          <w:b/>
+          <w:sz w:val="28"/>
+        </w:rPr>
+        <w:t>2. Публичный сайт</w:t>
+      </w:r>
+    </w:p>
+    <w:p>
+      <w:pPr>
+        <w:spacing w:after="120"/>
+      </w:pPr>
+      <w:r>
+        <w:rPr>
+          <w:rFonts w:ascii="Times New Roman" w:hAnsi="Times New Roman" w:eastAsia="Times New Roman"/>
+          <w:b w:val="0"/>
+          <w:sz w:val="24"/>
+        </w:rPr>
+        <w:t>https://www.saucedemo.com/ — login, inventory, menu, cart, checkout.</w:t>
+      </w:r>
+    </w:p>
+    <w:p>
+      <w:pPr>
+        <w:pStyle w:val="Heading1"/>
+      </w:pPr>
+      <w:r>
+        <w:rPr>
+          <w:rFonts w:ascii="Times New Roman" w:hAnsi="Times New Roman" w:eastAsia="Times New Roman"/>
+          <w:b/>
+          <w:sz w:val="28"/>
+        </w:rPr>
+        <w:t>3. Responsive матрица (новое)</w:t>
+      </w:r>
+    </w:p>
+    <w:p>
+      <w:pPr>
+        <w:spacing w:after="120"/>
+      </w:pPr>
+      <w:r>
+        <w:rPr>
+          <w:rFonts w:ascii="Times New Roman" w:hAnsi="Times New Roman" w:eastAsia="Times New Roman"/>
+          <w:b w:val="0"/>
+          <w:sz w:val="24"/>
+        </w:rPr>
+        <w:t>Chrome CDP (tablet/phone) + window resize; Firefox — только resize.</w:t>
+      </w:r>
+    </w:p>
+    <w:tbl>
+      <w:tblPr>
+        <w:tblStyle w:val="TableGrid"/>
+        <w:tblW w:type="auto" w:w="0"/>
+        <w:tblLook w:firstColumn="1" w:firstRow="1" w:lastColumn="0" w:lastRow="0" w:noHBand="0" w:noVBand="1" w:val="04A0"/>
+      </w:tblPr>
+      <w:tblGrid>
+        <w:gridCol w:w="4986"/>
+        <w:gridCol w:w="4986"/>
+      </w:tblGrid>
+      <w:tr>
+        <w:tc>
+          <w:tcPr>
+            <w:tcW w:type="dxa" w:w="4986"/>
+          </w:tcPr>
+          <w:p>
+            <w:r>
+              <w:t>ID</w:t>
+            </w:r>
+          </w:p>
+        </w:tc>
+        <w:tc>
+          <w:tcPr>
+            <w:tcW w:type="dxa" w:w="4986"/>
+          </w:tcPr>
+          <w:p>
+            <w:r>
+              <w:t>Сценарий</w:t>
+            </w:r>
+          </w:p>
+        </w:tc>
+      </w:tr>
+      <w:tr>
+        <w:tc>
+          <w:tcPr>
+            <w:tcW w:type="dxa" w:w="4986"/>
+          </w:tcPr>
+          <w:p>
+            <w:r>
+              <w:t>TC10-R01</w:t>
+            </w:r>
+          </w:p>
+        </w:tc>
+        <w:tc>
+          <w:tcPr>
+            <w:tcW w:type="dxa" w:w="4986"/>
+          </w:tcPr>
+          <w:p>
+            <w:r>
+              <w:t>layout / overflow</w:t>
+            </w:r>
+          </w:p>
+        </w:tc>
+      </w:tr>
+      <w:tr>
+        <w:tc>
+          <w:tcPr>
+            <w:tcW w:type="dxa" w:w="4986"/>
+          </w:tcPr>
+          <w:p>
+            <w:r>
+              <w:t>TC10-R02</w:t>
+            </w:r>
+          </w:p>
+        </w:tc>
+        <w:tc>
+          <w:tcPr>
+            <w:tcW w:type="dxa" w:w="4986"/>
+          </w:tcPr>
+          <w:p>
+            <w:r>
+              <w:t>login form</w:t>
+            </w:r>
+          </w:p>
+        </w:tc>
+      </w:tr>
+      <w:tr>
+        <w:tc>
+          <w:tcPr>
+            <w:tcW w:type="dxa" w:w="4986"/>
+          </w:tcPr>
+          <w:p>
+            <w:r>
+              <w:t>TC10-R03</w:t>
+            </w:r>
+          </w:p>
+        </w:tc>
+        <w:tc>
+          <w:tcPr>
+            <w:tcW w:type="dxa" w:w="4986"/>
+          </w:tcPr>
+          <w:p>
+            <w:r>
+              <w:t>inventory</w:t>
+            </w:r>
+          </w:p>
+        </w:tc>
+      </w:tr>
+      <w:tr>
+        <w:tc>
+          <w:tcPr>
+            <w:tcW w:type="dxa" w:w="4986"/>
+          </w:tcPr>
+          <w:p>
+            <w:r>
+              <w:t>TC10-R04</w:t>
+            </w:r>
+          </w:p>
+        </w:tc>
+        <w:tc>
+          <w:tcPr>
+            <w:tcW w:type="dxa" w:w="4986"/>
+          </w:tcPr>
+          <w:p>
+            <w:r>
+              <w:t>burger menu</w:t>
+            </w:r>
+          </w:p>
+        </w:tc>
+      </w:tr>
+      <w:tr>
+        <w:tc>
+          <w:tcPr>
+            <w:tcW w:type="dxa" w:w="4986"/>
+          </w:tcPr>
+          <w:p>
+            <w:r>
+              <w:t>TC10-R05</w:t>
+            </w:r>
+          </w:p>
+        </w:tc>
+        <w:tc>
+          <w:tcPr>
+            <w:tcW w:type="dxa" w:w="4986"/>
+          </w:tcPr>
+          <w:p>
+            <w:r>
+              <w:t>cart</w:t>
+            </w:r>
+          </w:p>
+        </w:tc>
+      </w:tr>
+      <w:tr>
+        <w:tc>
+          <w:tcPr>
+            <w:tcW w:type="dxa" w:w="4986"/>
+          </w:tcPr>
+          <w:p>
+            <w:r>
+              <w:t>TC10-R06</w:t>
+            </w:r>
+          </w:p>
+        </w:tc>
+        <w:tc>
+          <w:tcPr>
+            <w:tcW w:type="dxa" w:w="4986"/>
+          </w:tcPr>
+          <w:p>
+            <w:r>
+              <w:t>checkout form</w:t>
+            </w:r>
+          </w:p>
+        </w:tc>
+      </w:tr>
+    </w:tbl>
     <w:p>
       <w:pPr>
         <w:spacing w:after="120"/>
@@ -44,22 +301,20 @@
     </w:p>
     <w:p>
       <w:pPr>
-        <w:spacing w:after="120"/>
-        <w:jc w:val="center"/>
+        <w:spacing w:after="0"/>
       </w:pPr>
       <w:r>
         <w:rPr>
-          <w:rFonts w:ascii="Times New Roman" w:hAnsi="Times New Roman" w:eastAsia="Times New Roman"/>
-          <w:b/>
-          <w:sz w:val="24"/>
+          <w:rFonts w:ascii="Consolas" w:hAnsi="Consolas" w:eastAsia="Consolas"/>
+          <w:b w:val="0"/>
+          <w:sz w:val="18"/>
         </w:rPr>
-        <w:t>КТ №10. Кроссбраузерное тестирование, отчёты и listeners</w:t>
+        <w:t>============================= 6 passed in 42.73s ==============================</w:t>
       </w:r>
     </w:p>
     <w:p>
       <w:pPr>
         <w:spacing w:after="120"/>
-        <w:jc w:val="center"/>
       </w:pPr>
       <w:r>
         <w:rPr>
@@ -67,21 +322,203 @@
           <w:b w:val="0"/>
           <w:sz w:val="24"/>
         </w:rPr>
-        <w:t>Отчёт по контрольной точке</w:t>
+        <w:t>36 evidence rows; horizontal overflow: none observed.</w:t>
+      </w:r>
+    </w:p>
+    <w:p>
+      <w:r>
+        <w:drawing>
+          <wp:inline xmlns:a="http://schemas.openxmlformats.org/drawingml/2006/main" xmlns:pic="http://schemas.openxmlformats.org/drawingml/2006/picture">
+            <wp:extent cx="3240000" cy="7011692"/>
+            <wp:docPr id="1" name="Picture 1"/>
+            <wp:cNvGraphicFramePr>
+              <a:graphicFrameLocks noChangeAspect="1"/>
+            </wp:cNvGraphicFramePr>
+            <a:graphic>
+              <a:graphicData uri="http://schemas.openxmlformats.org/drawingml/2006/picture">
+                <pic:pic>
+                  <pic:nvPicPr>
+                    <pic:cNvPr id="0" name="chrome_phone_r02_login_form.png"/>
+                    <pic:cNvPicPr/>
+                  </pic:nvPicPr>
+                  <pic:blipFill>
+                    <a:blip r:embed="rId9"/>
+                    <a:stretch>
+                      <a:fillRect/>
+                    </a:stretch>
+                  </pic:blipFill>
+                  <pic:spPr>
+                    <a:xfrm>
+                      <a:off x="0" y="0"/>
+                      <a:ext cx="3240000" cy="7011692"/>
+                    </a:xfrm>
+                    <a:prstGeom prst="rect"/>
+                  </pic:spPr>
+                </pic:pic>
+              </a:graphicData>
+            </a:graphic>
+          </wp:inline>
+        </w:drawing>
       </w:r>
     </w:p>
     <w:p>
       <w:pPr>
-        <w:spacing w:after="120"/>
         <w:jc w:val="center"/>
       </w:pPr>
       <w:r>
         <w:rPr>
           <w:rFonts w:ascii="Times New Roman" w:hAnsi="Times New Roman" w:eastAsia="Times New Roman"/>
           <w:b w:val="0"/>
-          <w:sz w:val="24"/>
+          <w:sz w:val="20"/>
         </w:rPr>
-        <w:t>Дата: 2026-10-10</w:t>
+        <w:t>Chrome phone — login</w:t>
+      </w:r>
+    </w:p>
+    <w:p>
+      <w:r>
+        <w:drawing>
+          <wp:inline xmlns:a="http://schemas.openxmlformats.org/drawingml/2006/main" xmlns:pic="http://schemas.openxmlformats.org/drawingml/2006/picture">
+            <wp:extent cx="3240000" cy="4866480"/>
+            <wp:docPr id="2" name="Picture 2"/>
+            <wp:cNvGraphicFramePr>
+              <a:graphicFrameLocks noChangeAspect="1"/>
+            </wp:cNvGraphicFramePr>
+            <a:graphic>
+              <a:graphicData uri="http://schemas.openxmlformats.org/drawingml/2006/picture">
+                <pic:pic>
+                  <pic:nvPicPr>
+                    <pic:cNvPr id="0" name="firefox_phone_r03_inventory.png"/>
+                    <pic:cNvPicPr/>
+                  </pic:nvPicPr>
+                  <pic:blipFill>
+                    <a:blip r:embed="rId10"/>
+                    <a:stretch>
+                      <a:fillRect/>
+                    </a:stretch>
+                  </pic:blipFill>
+                  <pic:spPr>
+                    <a:xfrm>
+                      <a:off x="0" y="0"/>
+                      <a:ext cx="3240000" cy="4866480"/>
+                    </a:xfrm>
+                    <a:prstGeom prst="rect"/>
+                  </pic:spPr>
+                </pic:pic>
+              </a:graphicData>
+            </a:graphic>
+          </wp:inline>
+        </w:drawing>
+      </w:r>
+    </w:p>
+    <w:p>
+      <w:pPr>
+        <w:jc w:val="center"/>
+      </w:pPr>
+      <w:r>
+        <w:rPr>
+          <w:rFonts w:ascii="Times New Roman" w:hAnsi="Times New Roman" w:eastAsia="Times New Roman"/>
+          <w:b w:val="0"/>
+          <w:sz w:val="20"/>
+        </w:rPr>
+        <w:t>Firefox phone — inventory</w:t>
+      </w:r>
+    </w:p>
+    <w:p>
+      <w:r>
+        <w:drawing>
+          <wp:inline xmlns:a="http://schemas.openxmlformats.org/drawingml/2006/main" xmlns:pic="http://schemas.openxmlformats.org/drawingml/2006/picture">
+            <wp:extent cx="3240000" cy="4320000"/>
+            <wp:docPr id="3" name="Picture 3"/>
+            <wp:cNvGraphicFramePr>
+              <a:graphicFrameLocks noChangeAspect="1"/>
+            </wp:cNvGraphicFramePr>
+            <a:graphic>
+              <a:graphicData uri="http://schemas.openxmlformats.org/drawingml/2006/picture">
+                <pic:pic>
+                  <pic:nvPicPr>
+                    <pic:cNvPr id="0" name="chrome_tablet_r04_menu_open.png"/>
+                    <pic:cNvPicPr/>
+                  </pic:nvPicPr>
+                  <pic:blipFill>
+                    <a:blip r:embed="rId11"/>
+                    <a:stretch>
+                      <a:fillRect/>
+                    </a:stretch>
+                  </pic:blipFill>
+                  <pic:spPr>
+                    <a:xfrm>
+                      <a:off x="0" y="0"/>
+                      <a:ext cx="3240000" cy="4320000"/>
+                    </a:xfrm>
+                    <a:prstGeom prst="rect"/>
+                  </pic:spPr>
+                </pic:pic>
+              </a:graphicData>
+            </a:graphic>
+          </wp:inline>
+        </w:drawing>
+      </w:r>
+    </w:p>
+    <w:p>
+      <w:pPr>
+        <w:jc w:val="center"/>
+      </w:pPr>
+      <w:r>
+        <w:rPr>
+          <w:rFonts w:ascii="Times New Roman" w:hAnsi="Times New Roman" w:eastAsia="Times New Roman"/>
+          <w:b w:val="0"/>
+          <w:sz w:val="20"/>
+        </w:rPr>
+        <w:t>Chrome tablet — menu</w:t>
+      </w:r>
+    </w:p>
+    <w:p>
+      <w:r>
+        <w:drawing>
+          <wp:inline xmlns:a="http://schemas.openxmlformats.org/drawingml/2006/main" xmlns:pic="http://schemas.openxmlformats.org/drawingml/2006/picture">
+            <wp:extent cx="3240000" cy="1704185"/>
+            <wp:docPr id="4" name="Picture 4"/>
+            <wp:cNvGraphicFramePr>
+              <a:graphicFrameLocks noChangeAspect="1"/>
+            </wp:cNvGraphicFramePr>
+            <a:graphic>
+              <a:graphicData uri="http://schemas.openxmlformats.org/drawingml/2006/picture">
+                <pic:pic>
+                  <pic:nvPicPr>
+                    <pic:cNvPr id="0" name="chrome_desktop_r06_checkout.png"/>
+                    <pic:cNvPicPr/>
+                  </pic:nvPicPr>
+                  <pic:blipFill>
+                    <a:blip r:embed="rId12"/>
+                    <a:stretch>
+                      <a:fillRect/>
+                    </a:stretch>
+                  </pic:blipFill>
+                  <pic:spPr>
+                    <a:xfrm>
+                      <a:off x="0" y="0"/>
+                      <a:ext cx="3240000" cy="1704185"/>
+                    </a:xfrm>
+                    <a:prstGeom prst="rect"/>
+                  </pic:spPr>
+                </pic:pic>
+              </a:graphicData>
+            </a:graphic>
+          </wp:inline>
+        </w:drawing>
+      </w:r>
+    </w:p>
+    <w:p>
+      <w:pPr>
+        <w:jc w:val="center"/>
+      </w:pPr>
+      <w:r>
+        <w:rPr>
+          <w:rFonts w:ascii="Times New Roman" w:hAnsi="Times New Roman" w:eastAsia="Times New Roman"/>
+          <w:b w:val="0"/>
+          <w:sz w:val="20"/>
+        </w:rPr>
+        <w:t>Chrome desktop — checkout validation</w:t>
       </w:r>
     </w:p>
     <w:p>
@@ -94,7 +531,7 @@
           <w:b/>
           <w:sz w:val="28"/>
         </w:rPr>
-        <w:t>1. Цель</w:t>
+        <w:t>4. Исторический functional suite (сохранён)</w:t>
       </w:r>
     </w:p>
     <w:p>
@@ -107,163 +544,7 @@
           <w:b w:val="0"/>
           <w:sz w:val="24"/>
         </w:rPr>
-        <w:t>Реализовать матрицу Chrome × Firefox (5 сценариев × 2 браузера), подключить Selenium WebDriver Event Listener и pytest-отчёты (HTML, JUnit, screenshot-on-failure).</w:t>
-      </w:r>
-    </w:p>
-    <w:p>
-      <w:pPr>
-        <w:spacing w:after="120"/>
-      </w:pPr>
-      <w:r>
-        <w:rPr>
-          <w:rFonts w:ascii="Times New Roman" w:hAnsi="Times New Roman" w:eastAsia="Times New Roman"/>
-          <w:b/>
-          <w:sz w:val="24"/>
-        </w:rPr>
-        <w:t>Презентация cloud.ithub.ru (КТ10) без авторизации недоступна; полное соответствие скрытым слайдам не утверждается.</w:t>
-      </w:r>
-    </w:p>
-    <w:p>
-      <w:pPr>
-        <w:pStyle w:val="Heading1"/>
-      </w:pPr>
-      <w:r>
-        <w:rPr>
-          <w:rFonts w:ascii="Times New Roman" w:hAnsi="Times New Roman" w:eastAsia="Times New Roman"/>
-          <w:b/>
-          <w:sz w:val="28"/>
-        </w:rPr>
-        <w:t>2. Среда</w:t>
-      </w:r>
-    </w:p>
-    <w:p>
-      <w:pPr>
-        <w:spacing w:after="120"/>
-      </w:pPr>
-      <w:r>
-        <w:rPr>
-          <w:rFonts w:ascii="Times New Roman" w:hAnsi="Times New Roman" w:eastAsia="Times New Roman"/>
-          <w:b w:val="0"/>
-          <w:sz w:val="24"/>
-        </w:rPr>
-        <w:t>Windows 10; Python 3.13.2; Selenium 4.50.0; pytest 8.4.2; pytest-html 4.2.0; Chrome 155.0.8059.39; Firefox 157.0.1.</w:t>
-      </w:r>
-    </w:p>
-    <w:p>
-      <w:pPr>
-        <w:spacing w:after="120"/>
-      </w:pPr>
-      <w:r>
-        <w:rPr>
-          <w:rFonts w:ascii="Times New Roman" w:hAnsi="Times New Roman" w:eastAsia="Times New Roman"/>
-          <w:b w:val="0"/>
-          <w:sz w:val="24"/>
-        </w:rPr>
-        <w:t>Код: selenium/crossbrowser/ (отдельный kt10_driver на EventFiringWebDriver; корневой driver KT01–08 не изменён).</w:t>
-      </w:r>
-    </w:p>
-    <w:p>
-      <w:pPr>
-        <w:pStyle w:val="Heading1"/>
-      </w:pPr>
-      <w:r>
-        <w:rPr>
-          <w:rFonts w:ascii="Times New Roman" w:hAnsi="Times New Roman" w:eastAsia="Times New Roman"/>
-          <w:b/>
-          <w:sz w:val="28"/>
-        </w:rPr>
-        <w:t>3. Listener vs pytest hook</w:t>
-      </w:r>
-    </w:p>
-    <w:p>
-      <w:pPr>
-        <w:spacing w:after="120"/>
-      </w:pPr>
-      <w:r>
-        <w:rPr>
-          <w:rFonts w:ascii="Times New Roman" w:hAnsi="Times New Roman" w:eastAsia="Times New Roman"/>
-          <w:b w:val="0"/>
-          <w:sz w:val="24"/>
-        </w:rPr>
-        <w:t>Kt10EventListener (AbstractEventListener): before/after navigate и click, on_exception → selenium/artifacts/kt10/events.jsonl.</w:t>
-      </w:r>
-    </w:p>
-    <w:p>
-      <w:pPr>
-        <w:spacing w:after="120"/>
-      </w:pPr>
-      <w:r>
-        <w:rPr>
-          <w:rFonts w:ascii="Times New Roman" w:hAnsi="Times New Roman" w:eastAsia="Times New Roman"/>
-          <w:b w:val="0"/>
-          <w:sz w:val="24"/>
-        </w:rPr>
-        <w:t>pytest_runtest_makereport: run_summary.jsonl, PNG при FAIL, extras в HTML-отчёте.</w:t>
-      </w:r>
-    </w:p>
-    <w:p>
-      <w:pPr>
-        <w:pStyle w:val="Heading1"/>
-      </w:pPr>
-      <w:r>
-        <w:rPr>
-          <w:rFonts w:ascii="Times New Roman" w:hAnsi="Times New Roman" w:eastAsia="Times New Roman"/>
-          <w:b/>
-          <w:sz w:val="28"/>
-        </w:rPr>
-        <w:t>4. Команды</w:t>
-      </w:r>
-    </w:p>
-    <w:p>
-      <w:pPr>
-        <w:spacing w:after="0"/>
-      </w:pPr>
-      <w:r>
-        <w:rPr>
-          <w:rFonts w:ascii="Consolas" w:hAnsi="Consolas" w:eastAsia="Consolas"/>
-          <w:b w:val="0"/>
-          <w:sz w:val="18"/>
-        </w:rPr>
-        <w:t>.\scripts\diagnose_kt10.ps1</w:t>
-      </w:r>
-    </w:p>
-    <w:p>
-      <w:pPr>
-        <w:spacing w:after="0"/>
-      </w:pPr>
-      <w:r>
-        <w:rPr>
-          <w:rFonts w:ascii="Consolas" w:hAnsi="Consolas" w:eastAsia="Consolas"/>
-          <w:b w:val="0"/>
-          <w:sz w:val="18"/>
-        </w:rPr>
-        <w:t>.\scripts\run_kt10.ps1</w:t>
-      </w:r>
-    </w:p>
-    <w:p>
-      <w:pPr>
-        <w:pStyle w:val="Heading1"/>
-      </w:pPr>
-      <w:r>
-        <w:rPr>
-          <w:rFonts w:ascii="Times New Roman" w:hAnsi="Times New Roman" w:eastAsia="Times New Roman"/>
-          <w:b/>
-          <w:sz w:val="28"/>
-        </w:rPr>
-        <w:t>5. Результаты матрицы 5×2</w:t>
-      </w:r>
-    </w:p>
-    <w:p>
-      <w:pPr>
-        <w:spacing w:after="120"/>
-      </w:pPr>
-      <w:r>
-        <w:rPr>
-          <w:rFonts w:ascii="Times New Roman" w:hAnsi="Times New Roman" w:eastAsia="Times New Roman"/>
-          <w:b w:val="0"/>
-          <w:sz w:val="24"/>
-        </w:rPr>
-        <w:t>Диагностика: DIAGNOSE_PASS. Suite: 10 passed in 52.92s, exit 0.</w:t>
+        <w:t>Локальные фикстуры + EventFiringWebDriver listener. Не перезапускался в remediation.</w:t>
       </w:r>
     </w:p>
     <w:tbl>
@@ -305,7 +586,7 @@
           </w:tcPr>
           <w:p>
             <w:r>
-              <w:t>Браузер</w:t>
+              <w:t>Browsers</w:t>
             </w:r>
           </w:p>
         </w:tc>
@@ -315,7 +596,7 @@
           </w:tcPr>
           <w:p>
             <w:r>
-              <w:t>Статус</w:t>
+              <w:t>Status</w:t>
             </w:r>
           </w:p>
         </w:tc>
@@ -337,7 +618,7 @@
           </w:tcPr>
           <w:p>
             <w:r>
-              <w:t>title + URL + capabilities</w:t>
+              <w:t>title/URL</w:t>
             </w:r>
           </w:p>
         </w:tc>
@@ -347,49 +628,7 @@
           </w:tcPr>
           <w:p>
             <w:r>
-              <w:t>chrome</w:t>
-            </w:r>
-          </w:p>
-        </w:tc>
-        <w:tc>
-          <w:tcPr>
-            <w:tcW w:type="dxa" w:w="2493"/>
-          </w:tcPr>
-          <w:p>
-            <w:r>
-              <w:t>PASS</w:t>
-            </w:r>
-          </w:p>
-        </w:tc>
-      </w:tr>
-      <w:tr>
-        <w:tc>
-          <w:tcPr>
-            <w:tcW w:type="dxa" w:w="2493"/>
-          </w:tcPr>
-          <w:p>
-            <w:r>
-              <w:t>TC-10-01</w:t>
-            </w:r>
-          </w:p>
-        </w:tc>
-        <w:tc>
-          <w:tcPr>
-            <w:tcW w:type="dxa" w:w="2493"/>
-          </w:tcPr>
-          <w:p>
-            <w:r>
-              <w:t>title + URL + capabilities</w:t>
-            </w:r>
-          </w:p>
-        </w:tc>
-        <w:tc>
-          <w:tcPr>
-            <w:tcW w:type="dxa" w:w="2493"/>
-          </w:tcPr>
-          <w:p>
-            <w:r>
-              <w:t>firefox</w:t>
+              <w:t>chrome/firefox</w:t>
             </w:r>
           </w:p>
         </w:tc>
@@ -431,49 +670,7 @@
           </w:tcPr>
           <w:p>
             <w:r>
-              <w:t>chrome</w:t>
-            </w:r>
-          </w:p>
-        </w:tc>
-        <w:tc>
-          <w:tcPr>
-            <w:tcW w:type="dxa" w:w="2493"/>
-          </w:tcPr>
-          <w:p>
-            <w:r>
-              <w:t>PASS</w:t>
-            </w:r>
-          </w:p>
-        </w:tc>
-      </w:tr>
-      <w:tr>
-        <w:tc>
-          <w:tcPr>
-            <w:tcW w:type="dxa" w:w="2493"/>
-          </w:tcPr>
-          <w:p>
-            <w:r>
-              <w:t>TC-10-02</w:t>
-            </w:r>
-          </w:p>
-        </w:tc>
-        <w:tc>
-          <w:tcPr>
-            <w:tcW w:type="dxa" w:w="2493"/>
-          </w:tcPr>
-          <w:p>
-            <w:r>
-              <w:t>DOM click</w:t>
-            </w:r>
-          </w:p>
-        </w:tc>
-        <w:tc>
-          <w:tcPr>
-            <w:tcW w:type="dxa" w:w="2493"/>
-          </w:tcPr>
-          <w:p>
-            <w:r>
-              <w:t>firefox</w:t>
+              <w:t>chrome/firefox</w:t>
             </w:r>
           </w:p>
         </w:tc>
@@ -515,49 +712,7 @@
           </w:tcPr>
           <w:p>
             <w:r>
-              <w:t>chrome</w:t>
-            </w:r>
-          </w:p>
-        </w:tc>
-        <w:tc>
-          <w:tcPr>
-            <w:tcW w:type="dxa" w:w="2493"/>
-          </w:tcPr>
-          <w:p>
-            <w:r>
-              <w:t>PASS</w:t>
-            </w:r>
-          </w:p>
-        </w:tc>
-      </w:tr>
-      <w:tr>
-        <w:tc>
-          <w:tcPr>
-            <w:tcW w:type="dxa" w:w="2493"/>
-          </w:tcPr>
-          <w:p>
-            <w:r>
-              <w:t>TC-10-03</w:t>
-            </w:r>
-          </w:p>
-        </w:tc>
-        <w:tc>
-          <w:tcPr>
-            <w:tcW w:type="dxa" w:w="2493"/>
-          </w:tcPr>
-          <w:p>
-            <w:r>
-              <w:t>form validation</w:t>
-            </w:r>
-          </w:p>
-        </w:tc>
-        <w:tc>
-          <w:tcPr>
-            <w:tcW w:type="dxa" w:w="2493"/>
-          </w:tcPr>
-          <w:p>
-            <w:r>
-              <w:t>firefox</w:t>
+              <w:t>chrome/firefox</w:t>
             </w:r>
           </w:p>
         </w:tc>
@@ -599,49 +754,7 @@
           </w:tcPr>
           <w:p>
             <w:r>
-              <w:t>chrome</w:t>
-            </w:r>
-          </w:p>
-        </w:tc>
-        <w:tc>
-          <w:tcPr>
-            <w:tcW w:type="dxa" w:w="2493"/>
-          </w:tcPr>
-          <w:p>
-            <w:r>
-              <w:t>PASS</w:t>
-            </w:r>
-          </w:p>
-        </w:tc>
-      </w:tr>
-      <w:tr>
-        <w:tc>
-          <w:tcPr>
-            <w:tcW w:type="dxa" w:w="2493"/>
-          </w:tcPr>
-          <w:p>
-            <w:r>
-              <w:t>TC-10-04</w:t>
-            </w:r>
-          </w:p>
-        </w:tc>
-        <w:tc>
-          <w:tcPr>
-            <w:tcW w:type="dxa" w:w="2493"/>
-          </w:tcPr>
-          <w:p>
-            <w:r>
-              <w:t>window switch</w:t>
-            </w:r>
-          </w:p>
-        </w:tc>
-        <w:tc>
-          <w:tcPr>
-            <w:tcW w:type="dxa" w:w="2493"/>
-          </w:tcPr>
-          <w:p>
-            <w:r>
-              <w:t>firefox</w:t>
+              <w:t>chrome/firefox</w:t>
             </w:r>
           </w:p>
         </w:tc>
@@ -683,49 +796,7 @@
           </w:tcPr>
           <w:p>
             <w:r>
-              <w:t>chrome</w:t>
-            </w:r>
-          </w:p>
-        </w:tc>
-        <w:tc>
-          <w:tcPr>
-            <w:tcW w:type="dxa" w:w="2493"/>
-          </w:tcPr>
-          <w:p>
-            <w:r>
-              <w:t>PASS</w:t>
-            </w:r>
-          </w:p>
-        </w:tc>
-      </w:tr>
-      <w:tr>
-        <w:tc>
-          <w:tcPr>
-            <w:tcW w:type="dxa" w:w="2493"/>
-          </w:tcPr>
-          <w:p>
-            <w:r>
-              <w:t>TC-10-05</w:t>
-            </w:r>
-          </w:p>
-        </w:tc>
-        <w:tc>
-          <w:tcPr>
-            <w:tcW w:type="dxa" w:w="2493"/>
-          </w:tcPr>
-          <w:p>
-            <w:r>
-              <w:t>iframe switch</w:t>
-            </w:r>
-          </w:p>
-        </w:tc>
-        <w:tc>
-          <w:tcPr>
-            <w:tcW w:type="dxa" w:w="2493"/>
-          </w:tcPr>
-          <w:p>
-            <w:r>
-              <w:t>firefox</w:t>
+              <w:t>chrome/firefox</w:t>
             </w:r>
           </w:p>
         </w:tc>
@@ -763,67 +834,15 @@
           <w:b w:val="0"/>
           <w:sz w:val="18"/>
         </w:rPr>
-        <w:t>============================= 10 passed in 52.92s =============================</w:t>
-      </w:r>
-    </w:p>
-    <w:p>
-      <w:pPr>
-        <w:spacing w:after="120"/>
-      </w:pPr>
-      <w:r>
-        <w:rPr>
-          <w:rFonts w:ascii="Times New Roman" w:hAnsi="Times New Roman" w:eastAsia="Times New Roman"/>
-          <w:b w:val="0"/>
-          <w:sz w:val="24"/>
-        </w:rPr>
-        <w:t>browser_comparison.json: chrome 5 passed / firefox 5 passed (версии 155.0.8059.39 и 157.0.1).</w:t>
-      </w:r>
-    </w:p>
-    <w:p>
-      <w:pPr>
-        <w:pStyle w:val="Heading1"/>
-      </w:pPr>
-      <w:r>
-        <w:rPr>
-          <w:rFonts w:ascii="Times New Roman" w:hAnsi="Times New Roman" w:eastAsia="Times New Roman"/>
-          <w:b/>
-          <w:sz w:val="28"/>
-        </w:rPr>
-        <w:t>6. Controlled failure demo</w:t>
-      </w:r>
-    </w:p>
-    <w:p>
-      <w:pPr>
-        <w:spacing w:after="120"/>
-      </w:pPr>
-      <w:r>
-        <w:rPr>
-          <w:rFonts w:ascii="Times New Roman" w:hAnsi="Times New Roman" w:eastAsia="Times New Roman"/>
-          <w:b w:val="0"/>
-          <w:sz w:val="24"/>
-        </w:rPr>
-        <w:t>Отдельный прогон test_kt10_failure_demo.py: 1 failed (ожидаемо). Создан FAIL_chrome_….png и запись в failures.jsonl — доказательство screenshot-on-failure hook.</w:t>
-      </w:r>
-    </w:p>
-    <w:p>
-      <w:pPr>
-        <w:pStyle w:val="Heading1"/>
-      </w:pPr>
-      <w:r>
-        <w:rPr>
-          <w:rFonts w:ascii="Times New Roman" w:hAnsi="Times New Roman" w:eastAsia="Times New Roman"/>
-          <w:b/>
-          <w:sz w:val="28"/>
-        </w:rPr>
-        <w:t>7. Скриншоты</w:t>
+        <w:t>============================= 10 passed in 52.92s ==============================</w:t>
       </w:r>
     </w:p>
     <w:p>
       <w:r>
         <w:drawing>
           <wp:inline xmlns:a="http://schemas.openxmlformats.org/drawingml/2006/main" xmlns:pic="http://schemas.openxmlformats.org/drawingml/2006/picture">
-            <wp:extent cx="2700000" cy="1656286"/>
-            <wp:docPr id="1" name="Picture 1"/>
+            <wp:extent cx="2880000" cy="1766705"/>
+            <wp:docPr id="5" name="Picture 5"/>
             <wp:cNvGraphicFramePr>
               <a:graphicFrameLocks noChangeAspect="1"/>
             </wp:cNvGraphicFramePr>
@@ -835,7 +854,7 @@
                     <pic:cNvPicPr/>
                   </pic:nvPicPr>
                   <pic:blipFill>
-                    <a:blip r:embed="rId9"/>
+                    <a:blip r:embed="rId13"/>
                     <a:stretch>
                       <a:fillRect/>
                     </a:stretch>
@@ -843,7 +862,7 @@
                   <pic:spPr>
                     <a:xfrm>
                       <a:off x="0" y="0"/>
-                      <a:ext cx="2700000" cy="1656286"/>
+                      <a:ext cx="2880000" cy="1766705"/>
                     </a:xfrm>
                     <a:prstGeom prst="rect"/>
                   </pic:spPr>
@@ -862,17 +881,17 @@
         <w:rPr>
           <w:rFonts w:ascii="Times New Roman" w:hAnsi="Times New Roman" w:eastAsia="Times New Roman"/>
           <w:b w:val="0"/>
-          <w:sz w:val="22"/>
+          <w:sz w:val="20"/>
         </w:rPr>
-        <w:t>Рисунок 1 — Chrome: home / title</w:t>
+        <w:t>Исторический Chrome home</w:t>
       </w:r>
     </w:p>
     <w:p>
       <w:r>
         <w:drawing>
           <wp:inline xmlns:a="http://schemas.openxmlformats.org/drawingml/2006/main" xmlns:pic="http://schemas.openxmlformats.org/drawingml/2006/picture">
-            <wp:extent cx="2700000" cy="1769436"/>
-            <wp:docPr id="2" name="Picture 2"/>
+            <wp:extent cx="2880000" cy="1887399"/>
+            <wp:docPr id="6" name="Picture 6"/>
             <wp:cNvGraphicFramePr>
               <a:graphicFrameLocks noChangeAspect="1"/>
             </wp:cNvGraphicFramePr>
@@ -884,7 +903,7 @@
                     <pic:cNvPicPr/>
                   </pic:nvPicPr>
                   <pic:blipFill>
-                    <a:blip r:embed="rId10"/>
+                    <a:blip r:embed="rId14"/>
                     <a:stretch>
                       <a:fillRect/>
                     </a:stretch>
@@ -892,7 +911,7 @@
                   <pic:spPr>
                     <a:xfrm>
                       <a:off x="0" y="0"/>
-                      <a:ext cx="2700000" cy="1769436"/>
+                      <a:ext cx="2880000" cy="1887399"/>
                     </a:xfrm>
                     <a:prstGeom prst="rect"/>
                   </pic:spPr>
@@ -911,450 +930,9 @@
         <w:rPr>
           <w:rFonts w:ascii="Times New Roman" w:hAnsi="Times New Roman" w:eastAsia="Times New Roman"/>
           <w:b w:val="0"/>
-          <w:sz w:val="22"/>
+          <w:sz w:val="20"/>
         </w:rPr>
-        <w:t>Рисунок 2 — Firefox: home / title</w:t>
-      </w:r>
-    </w:p>
-    <w:p>
-      <w:r>
-        <w:drawing>
-          <wp:inline xmlns:a="http://schemas.openxmlformats.org/drawingml/2006/main" xmlns:pic="http://schemas.openxmlformats.org/drawingml/2006/picture">
-            <wp:extent cx="2700000" cy="1656286"/>
-            <wp:docPr id="3" name="Picture 3"/>
-            <wp:cNvGraphicFramePr>
-              <a:graphicFrameLocks noChangeAspect="1"/>
-            </wp:cNvGraphicFramePr>
-            <a:graphic>
-              <a:graphicData uri="http://schemas.openxmlformats.org/drawingml/2006/picture">
-                <pic:pic>
-                  <pic:nvPicPr>
-                    <pic:cNvPr id="0" name="chrome_02_dom_click.png"/>
-                    <pic:cNvPicPr/>
-                  </pic:nvPicPr>
-                  <pic:blipFill>
-                    <a:blip r:embed="rId11"/>
-                    <a:stretch>
-                      <a:fillRect/>
-                    </a:stretch>
-                  </pic:blipFill>
-                  <pic:spPr>
-                    <a:xfrm>
-                      <a:off x="0" y="0"/>
-                      <a:ext cx="2700000" cy="1656286"/>
-                    </a:xfrm>
-                    <a:prstGeom prst="rect"/>
-                  </pic:spPr>
-                </pic:pic>
-              </a:graphicData>
-            </a:graphic>
-          </wp:inline>
-        </w:drawing>
-      </w:r>
-    </w:p>
-    <w:p>
-      <w:pPr>
-        <w:jc w:val="center"/>
-      </w:pPr>
-      <w:r>
-        <w:rPr>
-          <w:rFonts w:ascii="Times New Roman" w:hAnsi="Times New Roman" w:eastAsia="Times New Roman"/>
-          <w:b w:val="0"/>
-          <w:sz w:val="22"/>
-        </w:rPr>
-        <w:t>Рисунок 3 — Chrome: DOM click</w:t>
-      </w:r>
-    </w:p>
-    <w:p>
-      <w:r>
-        <w:drawing>
-          <wp:inline xmlns:a="http://schemas.openxmlformats.org/drawingml/2006/main" xmlns:pic="http://schemas.openxmlformats.org/drawingml/2006/picture">
-            <wp:extent cx="2700000" cy="1769436"/>
-            <wp:docPr id="4" name="Picture 4"/>
-            <wp:cNvGraphicFramePr>
-              <a:graphicFrameLocks noChangeAspect="1"/>
-            </wp:cNvGraphicFramePr>
-            <a:graphic>
-              <a:graphicData uri="http://schemas.openxmlformats.org/drawingml/2006/picture">
-                <pic:pic>
-                  <pic:nvPicPr>
-                    <pic:cNvPr id="0" name="firefox_02_dom_click.png"/>
-                    <pic:cNvPicPr/>
-                  </pic:nvPicPr>
-                  <pic:blipFill>
-                    <a:blip r:embed="rId12"/>
-                    <a:stretch>
-                      <a:fillRect/>
-                    </a:stretch>
-                  </pic:blipFill>
-                  <pic:spPr>
-                    <a:xfrm>
-                      <a:off x="0" y="0"/>
-                      <a:ext cx="2700000" cy="1769436"/>
-                    </a:xfrm>
-                    <a:prstGeom prst="rect"/>
-                  </pic:spPr>
-                </pic:pic>
-              </a:graphicData>
-            </a:graphic>
-          </wp:inline>
-        </w:drawing>
-      </w:r>
-    </w:p>
-    <w:p>
-      <w:pPr>
-        <w:jc w:val="center"/>
-      </w:pPr>
-      <w:r>
-        <w:rPr>
-          <w:rFonts w:ascii="Times New Roman" w:hAnsi="Times New Roman" w:eastAsia="Times New Roman"/>
-          <w:b w:val="0"/>
-          <w:sz w:val="22"/>
-        </w:rPr>
-        <w:t>Рисунок 4 — Firefox: DOM click</w:t>
-      </w:r>
-    </w:p>
-    <w:p>
-      <w:r>
-        <w:drawing>
-          <wp:inline xmlns:a="http://schemas.openxmlformats.org/drawingml/2006/main" xmlns:pic="http://schemas.openxmlformats.org/drawingml/2006/picture">
-            <wp:extent cx="2700000" cy="1656286"/>
-            <wp:docPr id="5" name="Picture 5"/>
-            <wp:cNvGraphicFramePr>
-              <a:graphicFrameLocks noChangeAspect="1"/>
-            </wp:cNvGraphicFramePr>
-            <a:graphic>
-              <a:graphicData uri="http://schemas.openxmlformats.org/drawingml/2006/picture">
-                <pic:pic>
-                  <pic:nvPicPr>
-                    <pic:cNvPr id="0" name="chrome_04_form_valid.png"/>
-                    <pic:cNvPicPr/>
-                  </pic:nvPicPr>
-                  <pic:blipFill>
-                    <a:blip r:embed="rId13"/>
-                    <a:stretch>
-                      <a:fillRect/>
-                    </a:stretch>
-                  </pic:blipFill>
-                  <pic:spPr>
-                    <a:xfrm>
-                      <a:off x="0" y="0"/>
-                      <a:ext cx="2700000" cy="1656286"/>
-                    </a:xfrm>
-                    <a:prstGeom prst="rect"/>
-                  </pic:spPr>
-                </pic:pic>
-              </a:graphicData>
-            </a:graphic>
-          </wp:inline>
-        </w:drawing>
-      </w:r>
-    </w:p>
-    <w:p>
-      <w:pPr>
-        <w:jc w:val="center"/>
-      </w:pPr>
-      <w:r>
-        <w:rPr>
-          <w:rFonts w:ascii="Times New Roman" w:hAnsi="Times New Roman" w:eastAsia="Times New Roman"/>
-          <w:b w:val="0"/>
-          <w:sz w:val="22"/>
-        </w:rPr>
-        <w:t>Рисунок 5 — Chrome: форма OK</w:t>
-      </w:r>
-    </w:p>
-    <w:p>
-      <w:r>
-        <w:drawing>
-          <wp:inline xmlns:a="http://schemas.openxmlformats.org/drawingml/2006/main" xmlns:pic="http://schemas.openxmlformats.org/drawingml/2006/picture">
-            <wp:extent cx="2700000" cy="1769436"/>
-            <wp:docPr id="6" name="Picture 6"/>
-            <wp:cNvGraphicFramePr>
-              <a:graphicFrameLocks noChangeAspect="1"/>
-            </wp:cNvGraphicFramePr>
-            <a:graphic>
-              <a:graphicData uri="http://schemas.openxmlformats.org/drawingml/2006/picture">
-                <pic:pic>
-                  <pic:nvPicPr>
-                    <pic:cNvPr id="0" name="firefox_04_form_valid.png"/>
-                    <pic:cNvPicPr/>
-                  </pic:nvPicPr>
-                  <pic:blipFill>
-                    <a:blip r:embed="rId14"/>
-                    <a:stretch>
-                      <a:fillRect/>
-                    </a:stretch>
-                  </pic:blipFill>
-                  <pic:spPr>
-                    <a:xfrm>
-                      <a:off x="0" y="0"/>
-                      <a:ext cx="2700000" cy="1769436"/>
-                    </a:xfrm>
-                    <a:prstGeom prst="rect"/>
-                  </pic:spPr>
-                </pic:pic>
-              </a:graphicData>
-            </a:graphic>
-          </wp:inline>
-        </w:drawing>
-      </w:r>
-    </w:p>
-    <w:p>
-      <w:pPr>
-        <w:jc w:val="center"/>
-      </w:pPr>
-      <w:r>
-        <w:rPr>
-          <w:rFonts w:ascii="Times New Roman" w:hAnsi="Times New Roman" w:eastAsia="Times New Roman"/>
-          <w:b w:val="0"/>
-          <w:sz w:val="22"/>
-        </w:rPr>
-        <w:t>Рисунок 6 — Firefox: форма OK</w:t>
-      </w:r>
-    </w:p>
-    <w:p>
-      <w:r>
-        <w:drawing>
-          <wp:inline xmlns:a="http://schemas.openxmlformats.org/drawingml/2006/main" xmlns:pic="http://schemas.openxmlformats.org/drawingml/2006/picture">
-            <wp:extent cx="2700000" cy="1656286"/>
-            <wp:docPr id="7" name="Picture 7"/>
-            <wp:cNvGraphicFramePr>
-              <a:graphicFrameLocks noChangeAspect="1"/>
-            </wp:cNvGraphicFramePr>
-            <a:graphic>
-              <a:graphicData uri="http://schemas.openxmlformats.org/drawingml/2006/picture">
-                <pic:pic>
-                  <pic:nvPicPr>
-                    <pic:cNvPr id="0" name="chrome_05_secondary_window.png"/>
-                    <pic:cNvPicPr/>
-                  </pic:nvPicPr>
-                  <pic:blipFill>
-                    <a:blip r:embed="rId15"/>
-                    <a:stretch>
-                      <a:fillRect/>
-                    </a:stretch>
-                  </pic:blipFill>
-                  <pic:spPr>
-                    <a:xfrm>
-                      <a:off x="0" y="0"/>
-                      <a:ext cx="2700000" cy="1656286"/>
-                    </a:xfrm>
-                    <a:prstGeom prst="rect"/>
-                  </pic:spPr>
-                </pic:pic>
-              </a:graphicData>
-            </a:graphic>
-          </wp:inline>
-        </w:drawing>
-      </w:r>
-    </w:p>
-    <w:p>
-      <w:pPr>
-        <w:jc w:val="center"/>
-      </w:pPr>
-      <w:r>
-        <w:rPr>
-          <w:rFonts w:ascii="Times New Roman" w:hAnsi="Times New Roman" w:eastAsia="Times New Roman"/>
-          <w:b w:val="0"/>
-          <w:sz w:val="22"/>
-        </w:rPr>
-        <w:t>Рисунок 7 — Chrome: второе окно</w:t>
-      </w:r>
-    </w:p>
-    <w:p>
-      <w:r>
-        <w:drawing>
-          <wp:inline xmlns:a="http://schemas.openxmlformats.org/drawingml/2006/main" xmlns:pic="http://schemas.openxmlformats.org/drawingml/2006/picture">
-            <wp:extent cx="2700000" cy="1769436"/>
-            <wp:docPr id="8" name="Picture 8"/>
-            <wp:cNvGraphicFramePr>
-              <a:graphicFrameLocks noChangeAspect="1"/>
-            </wp:cNvGraphicFramePr>
-            <a:graphic>
-              <a:graphicData uri="http://schemas.openxmlformats.org/drawingml/2006/picture">
-                <pic:pic>
-                  <pic:nvPicPr>
-                    <pic:cNvPr id="0" name="firefox_05_secondary_window.png"/>
-                    <pic:cNvPicPr/>
-                  </pic:nvPicPr>
-                  <pic:blipFill>
-                    <a:blip r:embed="rId16"/>
-                    <a:stretch>
-                      <a:fillRect/>
-                    </a:stretch>
-                  </pic:blipFill>
-                  <pic:spPr>
-                    <a:xfrm>
-                      <a:off x="0" y="0"/>
-                      <a:ext cx="2700000" cy="1769436"/>
-                    </a:xfrm>
-                    <a:prstGeom prst="rect"/>
-                  </pic:spPr>
-                </pic:pic>
-              </a:graphicData>
-            </a:graphic>
-          </wp:inline>
-        </w:drawing>
-      </w:r>
-    </w:p>
-    <w:p>
-      <w:pPr>
-        <w:jc w:val="center"/>
-      </w:pPr>
-      <w:r>
-        <w:rPr>
-          <w:rFonts w:ascii="Times New Roman" w:hAnsi="Times New Roman" w:eastAsia="Times New Roman"/>
-          <w:b w:val="0"/>
-          <w:sz w:val="22"/>
-        </w:rPr>
-        <w:t>Рисунок 8 — Firefox: второе окно</w:t>
-      </w:r>
-    </w:p>
-    <w:p>
-      <w:r>
-        <w:drawing>
-          <wp:inline xmlns:a="http://schemas.openxmlformats.org/drawingml/2006/main" xmlns:pic="http://schemas.openxmlformats.org/drawingml/2006/picture">
-            <wp:extent cx="2700000" cy="1656286"/>
-            <wp:docPr id="9" name="Picture 9"/>
-            <wp:cNvGraphicFramePr>
-              <a:graphicFrameLocks noChangeAspect="1"/>
-            </wp:cNvGraphicFramePr>
-            <a:graphic>
-              <a:graphicData uri="http://schemas.openxmlformats.org/drawingml/2006/picture">
-                <pic:pic>
-                  <pic:nvPicPr>
-                    <pic:cNvPr id="0" name="chrome_07_inside_iframe.png"/>
-                    <pic:cNvPicPr/>
-                  </pic:nvPicPr>
-                  <pic:blipFill>
-                    <a:blip r:embed="rId17"/>
-                    <a:stretch>
-                      <a:fillRect/>
-                    </a:stretch>
-                  </pic:blipFill>
-                  <pic:spPr>
-                    <a:xfrm>
-                      <a:off x="0" y="0"/>
-                      <a:ext cx="2700000" cy="1656286"/>
-                    </a:xfrm>
-                    <a:prstGeom prst="rect"/>
-                  </pic:spPr>
-                </pic:pic>
-              </a:graphicData>
-            </a:graphic>
-          </wp:inline>
-        </w:drawing>
-      </w:r>
-    </w:p>
-    <w:p>
-      <w:pPr>
-        <w:jc w:val="center"/>
-      </w:pPr>
-      <w:r>
-        <w:rPr>
-          <w:rFonts w:ascii="Times New Roman" w:hAnsi="Times New Roman" w:eastAsia="Times New Roman"/>
-          <w:b w:val="0"/>
-          <w:sz w:val="22"/>
-        </w:rPr>
-        <w:t>Рисунок 9 — Chrome: iframe</w:t>
-      </w:r>
-    </w:p>
-    <w:p>
-      <w:r>
-        <w:drawing>
-          <wp:inline xmlns:a="http://schemas.openxmlformats.org/drawingml/2006/main" xmlns:pic="http://schemas.openxmlformats.org/drawingml/2006/picture">
-            <wp:extent cx="2700000" cy="1769436"/>
-            <wp:docPr id="10" name="Picture 10"/>
-            <wp:cNvGraphicFramePr>
-              <a:graphicFrameLocks noChangeAspect="1"/>
-            </wp:cNvGraphicFramePr>
-            <a:graphic>
-              <a:graphicData uri="http://schemas.openxmlformats.org/drawingml/2006/picture">
-                <pic:pic>
-                  <pic:nvPicPr>
-                    <pic:cNvPr id="0" name="firefox_07_inside_iframe.png"/>
-                    <pic:cNvPicPr/>
-                  </pic:nvPicPr>
-                  <pic:blipFill>
-                    <a:blip r:embed="rId18"/>
-                    <a:stretch>
-                      <a:fillRect/>
-                    </a:stretch>
-                  </pic:blipFill>
-                  <pic:spPr>
-                    <a:xfrm>
-                      <a:off x="0" y="0"/>
-                      <a:ext cx="2700000" cy="1769436"/>
-                    </a:xfrm>
-                    <a:prstGeom prst="rect"/>
-                  </pic:spPr>
-                </pic:pic>
-              </a:graphicData>
-            </a:graphic>
-          </wp:inline>
-        </w:drawing>
-      </w:r>
-    </w:p>
-    <w:p>
-      <w:pPr>
-        <w:jc w:val="center"/>
-      </w:pPr>
-      <w:r>
-        <w:rPr>
-          <w:rFonts w:ascii="Times New Roman" w:hAnsi="Times New Roman" w:eastAsia="Times New Roman"/>
-          <w:b w:val="0"/>
-          <w:sz w:val="22"/>
-        </w:rPr>
-        <w:t>Рисунок 10 — Firefox: iframe</w:t>
-      </w:r>
-    </w:p>
-    <w:p>
-      <w:r>
-        <w:drawing>
-          <wp:inline xmlns:a="http://schemas.openxmlformats.org/drawingml/2006/main" xmlns:pic="http://schemas.openxmlformats.org/drawingml/2006/picture">
-            <wp:extent cx="2700000" cy="1656286"/>
-            <wp:docPr id="11" name="Picture 11"/>
-            <wp:cNvGraphicFramePr>
-              <a:graphicFrameLocks noChangeAspect="1"/>
-            </wp:cNvGraphicFramePr>
-            <a:graphic>
-              <a:graphicData uri="http://schemas.openxmlformats.org/drawingml/2006/picture">
-                <pic:pic>
-                  <pic:nvPicPr>
-                    <pic:cNvPr id="0" name="chrome_01_home_title.png"/>
-                    <pic:cNvPicPr/>
-                  </pic:nvPicPr>
-                  <pic:blipFill>
-                    <a:blip r:embed="rId9"/>
-                    <a:stretch>
-                      <a:fillRect/>
-                    </a:stretch>
-                  </pic:blipFill>
-                  <pic:spPr>
-                    <a:xfrm>
-                      <a:off x="0" y="0"/>
-                      <a:ext cx="2700000" cy="1656286"/>
-                    </a:xfrm>
-                    <a:prstGeom prst="rect"/>
-                  </pic:spPr>
-                </pic:pic>
-              </a:graphicData>
-            </a:graphic>
-          </wp:inline>
-        </w:drawing>
-      </w:r>
-    </w:p>
-    <w:p>
-      <w:pPr>
-        <w:jc w:val="center"/>
-      </w:pPr>
-      <w:r>
-        <w:rPr>
-          <w:rFonts w:ascii="Times New Roman" w:hAnsi="Times New Roman" w:eastAsia="Times New Roman"/>
-          <w:b w:val="0"/>
-          <w:sz w:val="22"/>
-        </w:rPr>
-        <w:t>Рисунок 11 — Controlled FAIL: screenshot-on-failure</w:t>
+        <w:t>Исторический Firefox home</w:t>
       </w:r>
     </w:p>
     <w:p>
@@ -1367,7 +945,300 @@
           <w:b/>
           <w:sz w:val="28"/>
         </w:rPr>
-        <w:t>8. Ограничения</w:t>
+        <w:t>5. Compliance</w:t>
+      </w:r>
+    </w:p>
+    <w:tbl>
+      <w:tblPr>
+        <w:tblStyle w:val="TableGrid"/>
+        <w:tblW w:type="auto" w:w="0"/>
+        <w:tblLook w:firstColumn="1" w:firstRow="1" w:lastColumn="0" w:lastRow="0" w:noHBand="0" w:noVBand="1" w:val="04A0"/>
+      </w:tblPr>
+      <w:tblGrid>
+        <w:gridCol w:w="3324"/>
+        <w:gridCol w:w="3324"/>
+        <w:gridCol w:w="3324"/>
+      </w:tblGrid>
+      <w:tr>
+        <w:tc>
+          <w:tcPr>
+            <w:tcW w:type="dxa" w:w="3324"/>
+          </w:tcPr>
+          <w:p>
+            <w:r>
+              <w:t>Требование</w:t>
+            </w:r>
+          </w:p>
+        </w:tc>
+        <w:tc>
+          <w:tcPr>
+            <w:tcW w:type="dxa" w:w="3324"/>
+          </w:tcPr>
+          <w:p>
+            <w:r>
+              <w:t>Реализация</w:t>
+            </w:r>
+          </w:p>
+        </w:tc>
+        <w:tc>
+          <w:tcPr>
+            <w:tcW w:type="dxa" w:w="3324"/>
+          </w:tcPr>
+          <w:p>
+            <w:r>
+              <w:t>Статус</w:t>
+            </w:r>
+          </w:p>
+        </w:tc>
+      </w:tr>
+      <w:tr>
+        <w:tc>
+          <w:tcPr>
+            <w:tcW w:type="dxa" w:w="3324"/>
+          </w:tcPr>
+          <w:p>
+            <w:r>
+              <w:t>Публичное адаптивное приложение</w:t>
+            </w:r>
+          </w:p>
+        </w:tc>
+        <w:tc>
+          <w:tcPr>
+            <w:tcW w:type="dxa" w:w="3324"/>
+          </w:tcPr>
+          <w:p>
+            <w:r>
+              <w:t>Sauce Demo</w:t>
+            </w:r>
+          </w:p>
+        </w:tc>
+        <w:tc>
+          <w:tcPr>
+            <w:tcW w:type="dxa" w:w="3324"/>
+          </w:tcPr>
+          <w:p>
+            <w:r>
+              <w:t>PASS</w:t>
+            </w:r>
+          </w:p>
+        </w:tc>
+      </w:tr>
+      <w:tr>
+        <w:tc>
+          <w:tcPr>
+            <w:tcW w:type="dxa" w:w="3324"/>
+          </w:tcPr>
+          <w:p>
+            <w:r>
+              <w:t>Разные браузеры</w:t>
+            </w:r>
+          </w:p>
+        </w:tc>
+        <w:tc>
+          <w:tcPr>
+            <w:tcW w:type="dxa" w:w="3324"/>
+          </w:tcPr>
+          <w:p>
+            <w:r>
+              <w:t>Chrome + Firefox</w:t>
+            </w:r>
+          </w:p>
+        </w:tc>
+        <w:tc>
+          <w:tcPr>
+            <w:tcW w:type="dxa" w:w="3324"/>
+          </w:tcPr>
+          <w:p>
+            <w:r>
+              <w:t>PASS</w:t>
+            </w:r>
+          </w:p>
+        </w:tc>
+      </w:tr>
+      <w:tr>
+        <w:tc>
+          <w:tcPr>
+            <w:tcW w:type="dxa" w:w="3324"/>
+          </w:tcPr>
+          <w:p>
+            <w:r>
+              <w:t>Desktop/tablet/phone</w:t>
+            </w:r>
+          </w:p>
+        </w:tc>
+        <w:tc>
+          <w:tcPr>
+            <w:tcW w:type="dxa" w:w="3324"/>
+          </w:tcPr>
+          <w:p>
+            <w:r>
+              <w:t>1440×900 / 768×1024 / 390×844</w:t>
+            </w:r>
+          </w:p>
+        </w:tc>
+        <w:tc>
+          <w:tcPr>
+            <w:tcW w:type="dxa" w:w="3324"/>
+          </w:tcPr>
+          <w:p>
+            <w:r>
+              <w:t>PASS</w:t>
+            </w:r>
+          </w:p>
+        </w:tc>
+      </w:tr>
+      <w:tr>
+        <w:tc>
+          <w:tcPr>
+            <w:tcW w:type="dxa" w:w="3324"/>
+          </w:tcPr>
+          <w:p>
+            <w:r>
+              <w:t>Меню/кнопки/формы</w:t>
+            </w:r>
+          </w:p>
+        </w:tc>
+        <w:tc>
+          <w:tcPr>
+            <w:tcW w:type="dxa" w:w="3324"/>
+          </w:tcPr>
+          <w:p>
+            <w:r>
+              <w:t>R02–R06</w:t>
+            </w:r>
+          </w:p>
+        </w:tc>
+        <w:tc>
+          <w:tcPr>
+            <w:tcW w:type="dxa" w:w="3324"/>
+          </w:tcPr>
+          <w:p>
+            <w:r>
+              <w:t>PASS</w:t>
+            </w:r>
+          </w:p>
+        </w:tc>
+      </w:tr>
+      <w:tr>
+        <w:tc>
+          <w:tcPr>
+            <w:tcW w:type="dxa" w:w="3324"/>
+          </w:tcPr>
+          <w:p>
+            <w:r>
+              <w:t>Адаптация размеров</w:t>
+            </w:r>
+          </w:p>
+        </w:tc>
+        <w:tc>
+          <w:tcPr>
+            <w:tcW w:type="dxa" w:w="3324"/>
+          </w:tcPr>
+          <w:p>
+            <w:r>
+              <w:t>viewport JSONL + screenshots</w:t>
+            </w:r>
+          </w:p>
+        </w:tc>
+        <w:tc>
+          <w:tcPr>
+            <w:tcW w:type="dxa" w:w="3324"/>
+          </w:tcPr>
+          <w:p>
+            <w:r>
+              <w:t>PASS</w:t>
+            </w:r>
+          </w:p>
+        </w:tc>
+      </w:tr>
+      <w:tr>
+        <w:tc>
+          <w:tcPr>
+            <w:tcW w:type="dxa" w:w="3324"/>
+          </w:tcPr>
+          <w:p>
+            <w:r>
+              <w:t>Документирование проблем</w:t>
+            </w:r>
+          </w:p>
+        </w:tc>
+        <w:tc>
+          <w:tcPr>
+            <w:tcW w:type="dxa" w:w="3324"/>
+          </w:tcPr>
+          <w:p>
+            <w:r>
+              <w:t>overflow: none observed</w:t>
+            </w:r>
+          </w:p>
+        </w:tc>
+        <w:tc>
+          <w:tcPr>
+            <w:tcW w:type="dxa" w:w="3324"/>
+          </w:tcPr>
+          <w:p>
+            <w:r>
+              <w:t>PASS</w:t>
+            </w:r>
+          </w:p>
+        </w:tc>
+      </w:tr>
+      <w:tr>
+        <w:tc>
+          <w:tcPr>
+            <w:tcW w:type="dxa" w:w="3324"/>
+          </w:tcPr>
+          <w:p>
+            <w:r>
+              <w:t>Отчёт с рекомендациями</w:t>
+            </w:r>
+          </w:p>
+        </w:tc>
+        <w:tc>
+          <w:tcPr>
+            <w:tcW w:type="dxa" w:w="3324"/>
+          </w:tcPr>
+          <w:p>
+            <w:r>
+              <w:t>KT10.docx + docs/kt10/</w:t>
+            </w:r>
+          </w:p>
+        </w:tc>
+        <w:tc>
+          <w:tcPr>
+            <w:tcW w:type="dxa" w:w="3324"/>
+          </w:tcPr>
+          <w:p>
+            <w:r>
+              <w:t>PASS</w:t>
+            </w:r>
+          </w:p>
+        </w:tc>
+      </w:tr>
+    </w:tbl>
+    <w:p>
+      <w:pPr>
+        <w:spacing w:after="120"/>
+      </w:pPr>
+      <w:r>
+        <w:rPr>
+          <w:rFonts w:ascii="Times New Roman" w:hAnsi="Times New Roman" w:eastAsia="Times New Roman"/>
+          <w:b w:val="0"/>
+          <w:sz w:val="24"/>
+        </w:rPr>
+      </w:r>
+    </w:p>
+    <w:p>
+      <w:pPr>
+        <w:pStyle w:val="Heading1"/>
+      </w:pPr>
+      <w:r>
+        <w:rPr>
+          <w:rFonts w:ascii="Times New Roman" w:hAnsi="Times New Roman" w:eastAsia="Times New Roman"/>
+          <w:b/>
+          <w:sz w:val="28"/>
+        </w:rPr>
+        <w:t>6. Заключение</w:t>
       </w:r>
     </w:p>
     <w:p>
@@ -1380,33 +1251,7 @@
           <w:b w:val="0"/>
           <w:sz w:val="24"/>
         </w:rPr>
-        <w:t>Локальные HTML-фикстуры (без публичных сайтов). Edge/Safari не входили в выбранную матрицу A. Размеры viewport Chrome/Firefox слегка отличаются (1384×849 vs 1384×907).</w:t>
-      </w:r>
-    </w:p>
-    <w:p>
-      <w:pPr>
-        <w:pStyle w:val="Heading1"/>
-      </w:pPr>
-      <w:r>
-        <w:rPr>
-          <w:rFonts w:ascii="Times New Roman" w:hAnsi="Times New Roman" w:eastAsia="Times New Roman"/>
-          <w:b/>
-          <w:sz w:val="28"/>
-        </w:rPr>
-        <w:t>9. Заключение</w:t>
-      </w:r>
-    </w:p>
-    <w:p>
-      <w:pPr>
-        <w:spacing w:after="120"/>
-      </w:pPr>
-      <w:r>
-        <w:rPr>
-          <w:rFonts w:ascii="Times New Roman" w:hAnsi="Times New Roman" w:eastAsia="Times New Roman"/>
-          <w:b w:val="0"/>
-          <w:sz w:val="24"/>
-        </w:rPr>
-        <w:t>КТ 10 выполнена: EventFiringWebDriver + listener, pytest HTML/JUnit, матрица 10/10 PASS, failure demo с скриншотом, отчёт. KT11/KT12 не начинались.</w:t>
+        <w:t>Добавлена responsive матрица Sauce Demo (6/6 PASS, 42.73 с). Критичных проблем раскладки не обнаружено. Listener/functional suite сохранены.</w:t>
       </w:r>
     </w:p>
     <w:sectPr>

</xml_diff>